<commit_message>
feat: Add optimized requirements-extractor MCP server with parallel processing and caching
- Add mcp-server-req-extractor-optimized.py with parallel API calls
- Add TIMEOUT_ANALYSIS.md explaining timeout issues and solutions
- Add OPTIMIZATION_GUIDE.md with usage instructions
- Add extracted requirements to ph2-de/spec-design.md
- Improve performance from 140s to 20s (70% faster)
- Add caching system for repeated extractions
- Update MCP configuration to use optimized version
</commit_message>
<xml_diff>
--- a/file/doc/1650-01_요구사항정의서_v1.0.docx
+++ b/file/doc/1650-01_요구사항정의서_v1.0.docx
@@ -186,7 +186,7 @@
           </mc:Choice>
           <mc:Fallback>
             <w:pict>
-              <v:line w14:anchorId="57FBDD6D" id="직선 연결선[R] 1" o:spid="_x0000_s1026" style="position:absolute;z-index:251659264;visibility:visible;mso-wrap-style:square;mso-width-percent:0;mso-wrap-distance-left:9pt;mso-wrap-distance-top:0;mso-wrap-distance-right:9pt;mso-wrap-distance-bottom:0;mso-position-horizontal:absolute;mso-position-horizontal-relative:text;mso-position-vertical:absolute;mso-position-vertical-relative:text;mso-width-percent:0;mso-width-relative:margin" from="-.75pt,38.3pt" to="452.75pt,38.3pt" o:gfxdata="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" strokecolor="black [3213]" strokeweight="2.25pt">
+              <v:line w14:anchorId="57FBDD6D" id="직선 연결선[R] 1" o:spid="_x0000_s1026" style="position:absolute;z-index:251659264;visibility:visible;mso-wrap-style:square;mso-width-percent:0;mso-wrap-distance-left:9pt;mso-wrap-distance-top:0;mso-wrap-distance-right:9pt;mso-wrap-distance-bottom:0;mso-position-horizontal:absolute;mso-position-horizontal-relative:text;mso-position-vertical:absolute;mso-position-vertical-relative:text;mso-width-percent:0;mso-width-relative:margin" from="-.75pt,38.3pt" to="452.75pt,38.3pt" o:gfxdata="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" strokecolor="black [3213]" strokeweight="2.25pt">
                 <v:stroke joinstyle="miter"/>
               </v:line>
             </w:pict>
@@ -389,7 +389,6 @@
         <w:autoSpaceDN/>
         <w:jc w:val="center"/>
         <w:rPr>
-          <w:rFonts w:hint="eastAsia"/>
           <w:sz w:val="16"/>
           <w:szCs w:val="18"/>
         </w:rPr>
@@ -409,9 +408,6 @@
         <w:autoSpaceDE/>
         <w:autoSpaceDN/>
         <w:jc w:val="both"/>
-        <w:rPr>
-          <w:rFonts w:hint="eastAsia"/>
-        </w:rPr>
         <w:sectPr>
           <w:headerReference w:type="default" r:id="rId8"/>
           <w:pgSz w:w="11906" w:h="16838"/>
@@ -450,7 +446,6 @@
             <w:pPr>
               <w:jc w:val="center"/>
               <w:rPr>
-                <w:rFonts w:hint="eastAsia"/>
                 <w:b/>
                 <w:bCs/>
               </w:rPr>
@@ -528,7 +523,6 @@
             <w:pPr>
               <w:jc w:val="center"/>
               <w:rPr>
-                <w:rFonts w:hint="eastAsia"/>
                 <w:b/>
                 <w:bCs/>
                 <w:sz w:val="20"/>
@@ -638,7 +632,6 @@
             <w:pPr>
               <w:jc w:val="center"/>
               <w:rPr>
-                <w:rFonts w:hint="eastAsia"/>
                 <w:sz w:val="20"/>
                 <w:szCs w:val="21"/>
               </w:rPr>
@@ -667,7 +660,6 @@
           <w:p>
             <w:pPr>
               <w:rPr>
-                <w:rFonts w:hint="eastAsia"/>
                 <w:sz w:val="20"/>
                 <w:szCs w:val="21"/>
               </w:rPr>
@@ -689,7 +681,6 @@
           <w:p>
             <w:pPr>
               <w:rPr>
-                <w:rFonts w:hint="eastAsia"/>
                 <w:sz w:val="20"/>
                 <w:szCs w:val="21"/>
               </w:rPr>
@@ -713,7 +704,6 @@
             <w:pPr>
               <w:jc w:val="center"/>
               <w:rPr>
-                <w:rFonts w:hint="eastAsia"/>
                 <w:sz w:val="20"/>
                 <w:szCs w:val="21"/>
               </w:rPr>
@@ -737,7 +727,6 @@
             <w:pPr>
               <w:jc w:val="center"/>
               <w:rPr>
-                <w:rFonts w:hint="eastAsia"/>
                 <w:sz w:val="20"/>
                 <w:szCs w:val="21"/>
               </w:rPr>
@@ -1546,18 +1535,9 @@
         </w:tc>
       </w:tr>
     </w:tbl>
+    <w:p/>
     <w:p>
       <w:pPr>
-        <w:rPr>
-          <w:rFonts w:hint="eastAsia"/>
-        </w:rPr>
-      </w:pPr>
-    </w:p>
-    <w:p>
-      <w:pPr>
-        <w:rPr>
-          <w:rFonts w:hint="eastAsia"/>
-        </w:rPr>
         <w:sectPr>
           <w:pgSz w:w="11906" w:h="16838"/>
           <w:pgMar w:top="1701" w:right="1440" w:bottom="1440" w:left="1440" w:header="851" w:footer="992" w:gutter="0"/>
@@ -1595,7 +1575,6 @@
             <w:pPr>
               <w:jc w:val="center"/>
               <w:rPr>
-                <w:rFonts w:hint="eastAsia"/>
                 <w:b/>
                 <w:bCs/>
               </w:rPr>
@@ -1613,13 +1592,7 @@
         </w:tc>
       </w:tr>
     </w:tbl>
-    <w:p>
-      <w:pPr>
-        <w:rPr>
-          <w:rFonts w:hint="eastAsia"/>
-        </w:rPr>
-      </w:pPr>
-    </w:p>
+    <w:p/>
     <w:p/>
     <w:p>
       <w:pPr>
@@ -1662,7 +1635,6 @@
         <w:pStyle w:val="a6"/>
         <w:ind w:left="440"/>
         <w:rPr>
-          <w:rFonts w:hint="eastAsia"/>
           <w:sz w:val="20"/>
           <w:szCs w:val="21"/>
         </w:rPr>
@@ -1714,7 +1686,6 @@
         <w:pStyle w:val="a6"/>
         <w:ind w:left="440"/>
         <w:rPr>
-          <w:rFonts w:hint="eastAsia"/>
           <w:sz w:val="20"/>
           <w:szCs w:val="21"/>
         </w:rPr>
@@ -1758,7 +1729,6 @@
         <w:pStyle w:val="a6"/>
         <w:ind w:left="992"/>
         <w:rPr>
-          <w:rFonts w:hint="eastAsia"/>
           <w:sz w:val="20"/>
           <w:szCs w:val="21"/>
         </w:rPr>
@@ -1801,23 +1771,13 @@
         </w:rPr>
         <w:t>AWS</w:t>
       </w:r>
-      <w:proofErr w:type="spellStart"/>
       <w:r>
         <w:rPr>
           <w:rFonts w:hint="eastAsia"/>
           <w:sz w:val="20"/>
           <w:szCs w:val="21"/>
         </w:rPr>
-        <w:t>를</w:t>
-      </w:r>
-      <w:proofErr w:type="spellEnd"/>
-      <w:r>
-        <w:rPr>
-          <w:rFonts w:hint="eastAsia"/>
-          <w:sz w:val="20"/>
-          <w:szCs w:val="21"/>
-        </w:rPr>
-        <w:t xml:space="preserve"> 통해 구축합니다.</w:t>
+        <w:t>를 통해 구축합니다.</w:t>
       </w:r>
     </w:p>
     <w:p>
@@ -1911,7 +1871,6 @@
               <w:ind w:left="0"/>
               <w:jc w:val="center"/>
               <w:rPr>
-                <w:rFonts w:hint="eastAsia"/>
                 <w:b/>
                 <w:bCs/>
                 <w:sz w:val="20"/>
@@ -1941,7 +1900,6 @@
               <w:ind w:left="0"/>
               <w:jc w:val="center"/>
               <w:rPr>
-                <w:rFonts w:hint="eastAsia"/>
                 <w:b/>
                 <w:bCs/>
                 <w:sz w:val="20"/>
@@ -1971,7 +1929,6 @@
               <w:ind w:left="0"/>
               <w:jc w:val="center"/>
               <w:rPr>
-                <w:rFonts w:hint="eastAsia"/>
                 <w:b/>
                 <w:bCs/>
                 <w:sz w:val="20"/>
@@ -2083,99 +2040,9 @@
               <w:pStyle w:val="a6"/>
               <w:ind w:left="0"/>
               <w:rPr>
-                <w:rFonts w:hint="eastAsia"/>
-                <w:b/>
-                <w:bCs/>
-                <w:sz w:val="20"/>
-                <w:szCs w:val="21"/>
-              </w:rPr>
-            </w:pPr>
-            <w:r>
-              <w:rPr>
-                <w:rFonts w:ascii="Apple SD Gothic Neo" w:eastAsia="Apple SD Gothic Neo" w:hAnsi="Apple SD Gothic Neo" w:hint="eastAsia"/>
-                <w:color w:val="000000"/>
-                <w:sz w:val="21"/>
-                <w:szCs w:val="21"/>
-              </w:rPr>
-              <w:t>13.208.128.117</w:t>
-            </w:r>
-          </w:p>
-        </w:tc>
-        <w:tc>
-          <w:tcPr>
-            <w:tcW w:w="1910" w:type="dxa"/>
-          </w:tcPr>
-          <w:p>
-            <w:pPr>
-              <w:pStyle w:val="a6"/>
-              <w:ind w:left="0"/>
-              <w:rPr>
-                <w:b/>
-                <w:bCs/>
-                <w:sz w:val="20"/>
-                <w:szCs w:val="21"/>
-              </w:rPr>
-            </w:pPr>
-          </w:p>
-        </w:tc>
-      </w:tr>
-      <w:tr>
-        <w:tc>
-          <w:tcPr>
-            <w:tcW w:w="1848" w:type="dxa"/>
-            <w:vMerge/>
-          </w:tcPr>
-          <w:p>
-            <w:pPr>
-              <w:pStyle w:val="a6"/>
-              <w:ind w:left="0"/>
-              <w:rPr>
-                <w:b/>
-                <w:bCs/>
-                <w:sz w:val="20"/>
-                <w:szCs w:val="21"/>
-              </w:rPr>
-            </w:pPr>
-          </w:p>
-        </w:tc>
-        <w:tc>
-          <w:tcPr>
-            <w:tcW w:w="1910" w:type="dxa"/>
-          </w:tcPr>
-          <w:p>
-            <w:pPr>
-              <w:pStyle w:val="a6"/>
-              <w:ind w:left="0"/>
-              <w:rPr>
-                <w:b/>
-                <w:bCs/>
-                <w:sz w:val="20"/>
-                <w:szCs w:val="21"/>
-              </w:rPr>
-            </w:pPr>
-            <w:r>
-              <w:rPr>
-                <w:b/>
-                <w:bCs/>
-                <w:sz w:val="20"/>
-                <w:szCs w:val="21"/>
-              </w:rPr>
-              <w:t>PEM</w:t>
-            </w:r>
-          </w:p>
-        </w:tc>
-        <w:tc>
-          <w:tcPr>
-            <w:tcW w:w="2356" w:type="dxa"/>
-          </w:tcPr>
-          <w:p>
-            <w:pPr>
-              <w:pStyle w:val="a6"/>
-              <w:ind w:left="0"/>
-              <w:rPr>
-                <w:rFonts w:ascii="Apple SD Gothic Neo" w:eastAsia="Apple SD Gothic Neo" w:hAnsi="Apple SD Gothic Neo" w:hint="eastAsia"/>
-                <w:color w:val="000000"/>
-                <w:sz w:val="21"/>
+                <w:b/>
+                <w:bCs/>
+                <w:sz w:val="20"/>
                 <w:szCs w:val="21"/>
               </w:rPr>
             </w:pPr>
@@ -2186,6 +2053,95 @@
                 <w:sz w:val="21"/>
                 <w:szCs w:val="21"/>
               </w:rPr>
+              <w:t>13.208.215.196</w:t>
+            </w:r>
+          </w:p>
+        </w:tc>
+        <w:tc>
+          <w:tcPr>
+            <w:tcW w:w="1910" w:type="dxa"/>
+          </w:tcPr>
+          <w:p>
+            <w:pPr>
+              <w:pStyle w:val="a6"/>
+              <w:ind w:left="0"/>
+              <w:rPr>
+                <w:b/>
+                <w:bCs/>
+                <w:sz w:val="20"/>
+                <w:szCs w:val="21"/>
+              </w:rPr>
+            </w:pPr>
+          </w:p>
+        </w:tc>
+      </w:tr>
+      <w:tr>
+        <w:tc>
+          <w:tcPr>
+            <w:tcW w:w="1848" w:type="dxa"/>
+            <w:vMerge/>
+          </w:tcPr>
+          <w:p>
+            <w:pPr>
+              <w:pStyle w:val="a6"/>
+              <w:ind w:left="0"/>
+              <w:rPr>
+                <w:b/>
+                <w:bCs/>
+                <w:sz w:val="20"/>
+                <w:szCs w:val="21"/>
+              </w:rPr>
+            </w:pPr>
+          </w:p>
+        </w:tc>
+        <w:tc>
+          <w:tcPr>
+            <w:tcW w:w="1910" w:type="dxa"/>
+          </w:tcPr>
+          <w:p>
+            <w:pPr>
+              <w:pStyle w:val="a6"/>
+              <w:ind w:left="0"/>
+              <w:rPr>
+                <w:b/>
+                <w:bCs/>
+                <w:sz w:val="20"/>
+                <w:szCs w:val="21"/>
+              </w:rPr>
+            </w:pPr>
+            <w:r>
+              <w:rPr>
+                <w:b/>
+                <w:bCs/>
+                <w:sz w:val="20"/>
+                <w:szCs w:val="21"/>
+              </w:rPr>
+              <w:t>PEM</w:t>
+            </w:r>
+          </w:p>
+        </w:tc>
+        <w:tc>
+          <w:tcPr>
+            <w:tcW w:w="2356" w:type="dxa"/>
+          </w:tcPr>
+          <w:p>
+            <w:pPr>
+              <w:pStyle w:val="a6"/>
+              <w:ind w:left="0"/>
+              <w:rPr>
+                <w:rFonts w:ascii="Apple SD Gothic Neo" w:eastAsia="Apple SD Gothic Neo" w:hAnsi="Apple SD Gothic Neo"/>
+                <w:color w:val="000000"/>
+                <w:sz w:val="21"/>
+                <w:szCs w:val="21"/>
+              </w:rPr>
+            </w:pPr>
+            <w:r>
+              <w:rPr>
+                <w:rFonts w:ascii="Apple SD Gothic Neo" w:eastAsia="Apple SD Gothic Neo" w:hAnsi="Apple SD Gothic Neo"/>
+                <w:color w:val="000000"/>
+                <w:sz w:val="21"/>
+                <w:szCs w:val="21"/>
+              </w:rPr>
               <w:t>/home/ec2-user/.ssh</w:t>
             </w:r>
             <w:r>
@@ -2197,7 +2153,6 @@
               </w:rPr>
               <w:t>/</w:t>
             </w:r>
-            <w:proofErr w:type="spellStart"/>
             <w:r>
               <w:rPr>
                 <w:rFonts w:ascii="Apple SD Gothic Neo" w:eastAsia="Apple SD Gothic Neo" w:hAnsi="Apple SD Gothic Neo"/>
@@ -2207,7 +2162,6 @@
               </w:rPr>
               <w:t>jacob.park-keypair.pem</w:t>
             </w:r>
-            <w:proofErr w:type="spellEnd"/>
           </w:p>
         </w:tc>
         <w:tc>
@@ -2380,108 +2334,108 @@
               <w:pStyle w:val="a6"/>
               <w:ind w:left="0"/>
               <w:rPr>
-                <w:rFonts w:ascii="Apple SD Gothic Neo" w:eastAsia="Apple SD Gothic Neo" w:hAnsi="Apple SD Gothic Neo" w:hint="eastAsia"/>
-                <w:color w:val="000000"/>
-                <w:sz w:val="21"/>
-                <w:szCs w:val="21"/>
-              </w:rPr>
-            </w:pPr>
-            <w:r>
-              <w:rPr>
-                <w:rFonts w:ascii="Apple SD Gothic Neo" w:eastAsia="Apple SD Gothic Neo" w:hAnsi="Apple SD Gothic Neo" w:hint="eastAsia"/>
-                <w:color w:val="000000"/>
-                <w:sz w:val="21"/>
-                <w:szCs w:val="21"/>
-              </w:rPr>
-              <w:t>15.168.175.64</w:t>
-            </w:r>
-          </w:p>
-        </w:tc>
-        <w:tc>
-          <w:tcPr>
-            <w:tcW w:w="1910" w:type="dxa"/>
-          </w:tcPr>
-          <w:p>
-            <w:pPr>
-              <w:pStyle w:val="a6"/>
-              <w:ind w:left="0"/>
-              <w:rPr>
-                <w:b/>
-                <w:bCs/>
-                <w:sz w:val="20"/>
-                <w:szCs w:val="21"/>
-              </w:rPr>
-            </w:pPr>
-          </w:p>
-        </w:tc>
-      </w:tr>
-      <w:tr>
-        <w:tc>
-          <w:tcPr>
-            <w:tcW w:w="1848" w:type="dxa"/>
-            <w:vMerge/>
-          </w:tcPr>
-          <w:p>
-            <w:pPr>
-              <w:pStyle w:val="a6"/>
-              <w:ind w:left="0"/>
-              <w:rPr>
-                <w:b/>
-                <w:bCs/>
-                <w:sz w:val="20"/>
-                <w:szCs w:val="21"/>
-              </w:rPr>
-            </w:pPr>
-          </w:p>
-        </w:tc>
-        <w:tc>
-          <w:tcPr>
-            <w:tcW w:w="1910" w:type="dxa"/>
-          </w:tcPr>
-          <w:p>
-            <w:pPr>
-              <w:pStyle w:val="a6"/>
-              <w:ind w:left="0"/>
-              <w:rPr>
-                <w:b/>
-                <w:bCs/>
-                <w:sz w:val="20"/>
-                <w:szCs w:val="21"/>
-              </w:rPr>
-            </w:pPr>
-            <w:r>
-              <w:rPr>
-                <w:b/>
-                <w:bCs/>
-                <w:sz w:val="20"/>
-                <w:szCs w:val="21"/>
-              </w:rPr>
-              <w:t>PEM</w:t>
-            </w:r>
-          </w:p>
-        </w:tc>
-        <w:tc>
-          <w:tcPr>
-            <w:tcW w:w="2356" w:type="dxa"/>
-          </w:tcPr>
-          <w:p>
-            <w:pPr>
-              <w:pStyle w:val="a6"/>
-              <w:ind w:left="0"/>
-              <w:rPr>
-                <w:rFonts w:ascii="Apple SD Gothic Neo" w:eastAsia="Apple SD Gothic Neo" w:hAnsi="Apple SD Gothic Neo" w:hint="eastAsia"/>
-                <w:color w:val="000000"/>
-                <w:sz w:val="21"/>
-                <w:szCs w:val="21"/>
-              </w:rPr>
-            </w:pPr>
-            <w:r>
-              <w:rPr>
                 <w:rFonts w:ascii="Apple SD Gothic Neo" w:eastAsia="Apple SD Gothic Neo" w:hAnsi="Apple SD Gothic Neo"/>
                 <w:color w:val="000000"/>
                 <w:sz w:val="21"/>
                 <w:szCs w:val="21"/>
               </w:rPr>
+            </w:pPr>
+            <w:r>
+              <w:rPr>
+                <w:rFonts w:ascii="Apple SD Gothic Neo" w:eastAsia="Apple SD Gothic Neo" w:hAnsi="Apple SD Gothic Neo"/>
+                <w:color w:val="000000"/>
+                <w:sz w:val="21"/>
+                <w:szCs w:val="21"/>
+              </w:rPr>
+              <w:t>15.168.175.0</w:t>
+            </w:r>
+          </w:p>
+        </w:tc>
+        <w:tc>
+          <w:tcPr>
+            <w:tcW w:w="1910" w:type="dxa"/>
+          </w:tcPr>
+          <w:p>
+            <w:pPr>
+              <w:pStyle w:val="a6"/>
+              <w:ind w:left="0"/>
+              <w:rPr>
+                <w:b/>
+                <w:bCs/>
+                <w:sz w:val="20"/>
+                <w:szCs w:val="21"/>
+              </w:rPr>
+            </w:pPr>
+          </w:p>
+        </w:tc>
+      </w:tr>
+      <w:tr>
+        <w:tc>
+          <w:tcPr>
+            <w:tcW w:w="1848" w:type="dxa"/>
+            <w:vMerge/>
+          </w:tcPr>
+          <w:p>
+            <w:pPr>
+              <w:pStyle w:val="a6"/>
+              <w:ind w:left="0"/>
+              <w:rPr>
+                <w:b/>
+                <w:bCs/>
+                <w:sz w:val="20"/>
+                <w:szCs w:val="21"/>
+              </w:rPr>
+            </w:pPr>
+          </w:p>
+        </w:tc>
+        <w:tc>
+          <w:tcPr>
+            <w:tcW w:w="1910" w:type="dxa"/>
+          </w:tcPr>
+          <w:p>
+            <w:pPr>
+              <w:pStyle w:val="a6"/>
+              <w:ind w:left="0"/>
+              <w:rPr>
+                <w:b/>
+                <w:bCs/>
+                <w:sz w:val="20"/>
+                <w:szCs w:val="21"/>
+              </w:rPr>
+            </w:pPr>
+            <w:r>
+              <w:rPr>
+                <w:b/>
+                <w:bCs/>
+                <w:sz w:val="20"/>
+                <w:szCs w:val="21"/>
+              </w:rPr>
+              <w:t>PEM</w:t>
+            </w:r>
+          </w:p>
+        </w:tc>
+        <w:tc>
+          <w:tcPr>
+            <w:tcW w:w="2356" w:type="dxa"/>
+          </w:tcPr>
+          <w:p>
+            <w:pPr>
+              <w:pStyle w:val="a6"/>
+              <w:ind w:left="0"/>
+              <w:rPr>
+                <w:rFonts w:ascii="Apple SD Gothic Neo" w:eastAsia="Apple SD Gothic Neo" w:hAnsi="Apple SD Gothic Neo"/>
+                <w:color w:val="000000"/>
+                <w:sz w:val="21"/>
+                <w:szCs w:val="21"/>
+              </w:rPr>
+            </w:pPr>
+            <w:r>
+              <w:rPr>
+                <w:rFonts w:ascii="Apple SD Gothic Neo" w:eastAsia="Apple SD Gothic Neo" w:hAnsi="Apple SD Gothic Neo"/>
+                <w:color w:val="000000"/>
+                <w:sz w:val="21"/>
+                <w:szCs w:val="21"/>
+              </w:rPr>
               <w:t>/home/ec2-user/.ssh</w:t>
             </w:r>
             <w:r>
@@ -2493,7 +2447,6 @@
               </w:rPr>
               <w:t>/</w:t>
             </w:r>
-            <w:proofErr w:type="spellStart"/>
             <w:r>
               <w:rPr>
                 <w:rFonts w:ascii="Apple SD Gothic Neo" w:eastAsia="Apple SD Gothic Neo" w:hAnsi="Apple SD Gothic Neo"/>
@@ -2503,7 +2456,6 @@
               </w:rPr>
               <w:t>jacob.park-keypair.pem</w:t>
             </w:r>
-            <w:proofErr w:type="spellEnd"/>
           </w:p>
         </w:tc>
         <w:tc>
@@ -2619,7 +2571,6 @@
         <w:pStyle w:val="a6"/>
         <w:ind w:left="992"/>
         <w:rPr>
-          <w:rFonts w:hint="eastAsia"/>
           <w:b/>
           <w:bCs/>
           <w:sz w:val="28"/>
@@ -2716,7 +2667,6 @@
           <w:pPr>
             <w:pStyle w:val="aa"/>
             <w:rPr>
-              <w:rFonts w:hint="eastAsia"/>
               <w:b/>
               <w:bCs/>
             </w:rPr>
@@ -3567,7 +3517,6 @@
   <w:style w:type="character" w:default="1" w:styleId="a0">
     <w:name w:val="Default Paragraph Font"/>
     <w:uiPriority w:val="1"/>
-    <w:semiHidden/>
     <w:unhideWhenUsed/>
   </w:style>
   <w:style w:type="table" w:default="1" w:styleId="a1">

</xml_diff>